<commit_message>
Alex Maldonado prep: weave in guest-suggested marketing questions
Co-Authored-By: Claude Opus 5.5 <noreply@anthropic.com>
</commit_message>
<xml_diff>
--- a/guest-prep/Alex_Maldonado_Interview_Prep.docx
+++ b/guest-prep/Alex_Maldonado_Interview_Prep.docx
@@ -169,7 +169,7 @@
         <w:t xml:space="preserve">Guest type: </w:t>
       </w:r>
       <w:r>
-        <w:t>A, newer producing agent, with a C overlay because he runs a marketing agency. Keep agency talk under 20% of the episode and always pull it back to what an agent does with it.</w:t>
+        <w:t>A, newer producing agent, with a strong C overlay: he spent about ten years in marketing before he got his license, and he runs the agency now. Blocks 3 and 4 use his marketing expertise. The agency itself gets one mention, in the close.</w:t>
       </w:r>
     </w:p>
     <w:p>
@@ -346,7 +346,7 @@
           <w:b/>
           <w:i w:val="0"/>
         </w:rPr>
-        <w:t>The closing-cost gap: first-generation buyers who saved the down payment, then hit closing costs and decided owning was out of reach, and the three places the rest of the money actually comes from (the seller, assistance programs, and the agent who knows to ask).</w:t>
+        <w:t>The buyer who has already decided they can't buy: first-generation buyers who saved the down payment, hit closing costs and gave up. Where the rest of the money comes from (Blocks 1 and 2), and how a marketer finds a buyer who isn't looking (Blocks 3 and 4).</w:t>
       </w:r>
     </w:p>
     <w:p>
@@ -529,6 +529,36 @@
       </w:r>
       <w:r>
         <w:t>Let him say it. Do not try to pronounce it before he tells the story.</w:t>
+      </w:r>
+    </w:p>
+    <w:p>
+      <w:pPr>
+        <w:pStyle w:val="ListBullet"/>
+        <w:spacing w:after="40"/>
+      </w:pPr>
+      <w:r>
+        <w:rPr>
+          <w:b/>
+        </w:rPr>
+        <w:t xml:space="preserve">His questions lean toward his agency. </w:t>
+      </w:r>
+      <w:r>
+        <w:t>Alex sent 18 suggested questions, almost all about marketing, ending with his free audit for agents. We used seven of them (see 4I). The audit gets one mention in the close and a show-notes link. If an answer turns into a pitch, ask "and for the agent doing it alone with no budget?"</w:t>
+      </w:r>
+    </w:p>
+    <w:p>
+      <w:pPr>
+        <w:pStyle w:val="ListBullet"/>
+        <w:spacing w:after="40"/>
+      </w:pPr>
+      <w:r>
+        <w:rPr>
+          <w:b/>
+        </w:rPr>
+        <w:t xml:space="preserve">The audit is for LA agents. </w:t>
+      </w:r>
+      <w:r>
+        <w:t>Confirm in the green room that he'll take agents from other markets before you send the audience to it.</w:t>
       </w:r>
     </w:p>
     <w:p>
@@ -841,7 +871,7 @@
           <w:b w:val="0"/>
           <w:i w:val="0"/>
         </w:rPr>
-        <w:t>Why this topic: it is the one thing Alex does that most agents in the audience skip, it works in every market, and it produces a checklist the listener can use on their next offer. His marketing background is a strong second topic, so it gets one block as the "how you find these buyers" angle instead of its own episode.</w:t>
+        <w:t>Why this topic: it is the one thing Alex does that most agents skip, it works in every market, and it produces a checklist the listener can use on their next offer. Alex asked to talk mostly about marketing. His marketing is where his expertise runs deepest, so it gets the back half of the episode, framed as the answer to one question: these buyers aren't looking for an agent, so how do you find them? That keeps it one episode instead of two interviews.</w:t>
       </w:r>
     </w:p>
     <w:p>
@@ -853,7 +883,7 @@
           <w:b w:val="0"/>
           <w:i/>
         </w:rPr>
-        <w:t>Four angles, one topic. Block 1 is the buyer who thinks they can't. Block 2 is getting the seller to pay. Block 3 is the programs nobody mentions. Block 4 is how you find these buyers without living on the phone. Every block ends on something a listener can do this week.</w:t>
+        <w:t>Four angles, one topic. Block 1 is the buyer who thinks they can't. Block 2 is where the rest of the money comes from. Block 3 is how you find a buyer who isn't looking. Block 4 is the no-budget version for the listener. Every block ends on something a listener can do this week.</w:t>
       </w:r>
     </w:p>
     <w:p>
@@ -961,7 +991,7 @@
         <w:pStyle w:val="Heading2"/>
       </w:pPr>
       <w:r>
-        <w:t>BLOCK 1: The Buyer Who Thinks They Can't (2:00 to 11:00)</w:t>
+        <w:t>BLOCK 1: The Buyer Who Thinks They Can't (2:00 to 10:00)</w:t>
       </w:r>
     </w:p>
     <w:p>
@@ -985,7 +1015,7 @@
           <w:b w:val="0"/>
           <w:i w:val="0"/>
         </w:rPr>
-        <w:t>Arc: the family, the hidden gap, the hard no, the question.</w:t>
+        <w:t>Arc: the family, the hidden gap, the hard no.</w:t>
       </w:r>
     </w:p>
     <w:p>
@@ -1184,7 +1214,7 @@
         <w:rPr>
           <w:i/>
         </w:rPr>
-        <w:t>"What's the actual question you ask, word for word?"</w:t>
+        <w:t>"What's the actual question you ask, word for word? Could an agent use it at their next buyer meeting?"</w:t>
       </w:r>
     </w:p>
     <w:p>
@@ -1203,7 +1233,7 @@
         <w:rPr>
           <w:i/>
         </w:rPr>
-        <w:t>The discovery question and when in the process he asks it. Whether the buyer usually already knows the closing-cost number or finds out late.</w:t>
+        <w:t>The discovery question and when in the process he asks it. Whether the buyer usually knows the closing-cost number or finds out late. A sentence the listener can steal.</w:t>
       </w:r>
     </w:p>
     <w:p>
@@ -1305,7 +1335,7 @@
         <w:rPr>
           <w:i/>
         </w:rPr>
-        <w:t>How he tells a client no without losing the client. The script for redirecting a buyer from the dream to the possible. Whether it worked.</w:t>
+        <w:t>How he tells a client no without losing the client. Whether it worked.</w:t>
       </w:r>
     </w:p>
     <w:p>
@@ -1334,6 +1364,57 @@
     </w:p>
     <w:p>
       <w:pPr>
+        <w:spacing w:after="120"/>
+      </w:pPr>
+      <w:r>
+        <w:rPr>
+          <w:b/>
+          <w:i w:val="0"/>
+        </w:rPr>
+        <w:t xml:space="preserve">BRIDGE TO NEXT BLOCK (read as written): </w:t>
+      </w:r>
+      <w:r>
+        <w:rPr>
+          <w:b w:val="0"/>
+          <w:i/>
+        </w:rPr>
+        <w:t>"So the buyer who thinks they can't often has most of it already. Let's talk about where the rest comes from, starting with the seller."</w:t>
+      </w:r>
+    </w:p>
+    <w:p>
+      <w:pPr>
+        <w:pStyle w:val="Heading2"/>
+      </w:pPr>
+      <w:r>
+        <w:t>BLOCK 2: Where the Rest of the Money Comes From (10:00 to 21:00)</w:t>
+      </w:r>
+    </w:p>
+    <w:p>
+      <w:pPr>
+        <w:spacing w:after="40"/>
+      </w:pPr>
+      <w:r>
+        <w:rPr>
+          <w:b w:val="0"/>
+          <w:i/>
+        </w:rPr>
+        <w:t>Audience note: individual agents working buyers in competitive markets, plus listing agents who receive these offers.</w:t>
+      </w:r>
+    </w:p>
+    <w:p>
+      <w:pPr>
+        <w:spacing w:after="120"/>
+      </w:pPr>
+      <w:r>
+        <w:rPr>
+          <w:b w:val="0"/>
+          <w:i w:val="0"/>
+        </w:rPr>
+        <w:t>Arc: the rule, the blind spot, the objection, the program and its catch, the call.</w:t>
+      </w:r>
+    </w:p>
+    <w:p>
+      <w:pPr>
         <w:spacing w:after="40"/>
       </w:pPr>
       <w:r>
@@ -1348,7 +1429,7 @@
           <w:b/>
           <w:i w:val="0"/>
         </w:rPr>
-        <w:t>For the agent listening who never talks about closing costs until the loan estimate shows up: what's the one question they should add to their first buyer meeting this week?</w:t>
+        <w:t>On an FHA loan the seller can cover up to 6% of the price in closing costs. Conventional with under 10% down, it's 3%. In a market like LA, where you're competing on price, how do you ask for a credit without your offer landing at the bottom of the pile?</w:t>
       </w:r>
     </w:p>
     <w:p>
@@ -1369,7 +1450,7 @@
           <w:b/>
           <w:sz w:val="21"/>
         </w:rPr>
-        <w:t>"What closing-cost question should every agent add to their first buyer meeting?"</w:t>
+        <w:t>"How do you ask for a seller credit without your offer going to the bottom?"</w:t>
       </w:r>
     </w:p>
     <w:p>
@@ -1388,7 +1469,7 @@
         <w:rPr>
           <w:i/>
         </w:rPr>
-        <w:t>"Give me the exact sentence."</w:t>
+        <w:t>"Do you raise the price to cover it? By how much, and what happens if it doesn't appraise?"</w:t>
       </w:r>
     </w:p>
     <w:p>
@@ -1407,7 +1488,7 @@
         <w:rPr>
           <w:i/>
         </w:rPr>
-        <w:t>A single question the listener can steal and use on their next consult.</w:t>
+        <w:t>The price-up, credit-back mechanics. How he protects the buyer if the appraisal comes in low. What percent he actually asks for.</w:t>
       </w:r>
     </w:p>
     <w:p>
@@ -1426,64 +1507,32 @@
         <w:rPr>
           <w:i/>
         </w:rPr>
-        <w:t>Individual agents, new agents.</w:t>
+        <w:t>Individual agents.</w:t>
       </w:r>
     </w:p>
     <w:p>
       <w:pPr>
-        <w:spacing w:after="0"/>
-      </w:pPr>
-    </w:p>
-    <w:p>
-      <w:pPr>
-        <w:spacing w:after="120"/>
+        <w:spacing w:after="40"/>
       </w:pPr>
       <w:r>
         <w:rPr>
           <w:b/>
           <w:i w:val="0"/>
         </w:rPr>
-        <w:t xml:space="preserve">BRIDGE TO NEXT BLOCK (read as written): </w:t>
+        <w:t xml:space="preserve">PRODUCER NOTE: </w:t>
       </w:r>
       <w:r>
         <w:rPr>
           <w:b w:val="0"/>
           <w:i/>
         </w:rPr>
-        <w:t>"So the buyer who thinks they can't often has most of it already. Let's talk about where the rest comes from, starting with the seller."</w:t>
+        <w:t>Do not accept "it depends." Ask for the last deal: price, credit amount, appraisal.</w:t>
       </w:r>
     </w:p>
     <w:p>
       <w:pPr>
-        <w:pStyle w:val="Heading2"/>
-      </w:pPr>
-      <w:r>
-        <w:t>BLOCK 2: Getting the Seller to Pay (11:00 to 22:00)</w:t>
-      </w:r>
-    </w:p>
-    <w:p>
-      <w:pPr>
-        <w:spacing w:after="40"/>
-      </w:pPr>
-      <w:r>
-        <w:rPr>
-          <w:b w:val="0"/>
-          <w:i/>
-        </w:rPr>
-        <w:t>Audience note: individual agents working buyers in competitive markets, plus listing agents who receive these offers.</w:t>
-      </w:r>
-    </w:p>
-    <w:p>
-      <w:pPr>
-        <w:spacing w:after="120"/>
-      </w:pPr>
-      <w:r>
-        <w:rPr>
-          <w:b w:val="0"/>
-          <w:i w:val="0"/>
-        </w:rPr>
-        <w:t>Arc: the rule, the blind spot, the objection, the settlement, the call.</w:t>
-      </w:r>
+        <w:spacing w:after="0"/>
+      </w:pPr>
     </w:p>
     <w:p>
       <w:pPr>
@@ -1501,7 +1550,7 @@
           <w:b/>
           <w:i w:val="0"/>
         </w:rPr>
-        <w:t>On an FHA loan the seller can cover up to 6% of the price in closing costs. Conventional with under 10% down, it's 3%. In a market like LA, where you're competing on price, how do you ask for a credit without your offer landing at the bottom of the pile?</w:t>
+        <w:t>I've interviewed hundreds of agents on this show, and almost none of them has named closing costs as the reason a first-time buyer didn't buy. You're saying it's one of the most common ones in your world. Why does the rest of the industry miss it?</w:t>
       </w:r>
     </w:p>
     <w:p>
@@ -1522,7 +1571,7 @@
           <w:b/>
           <w:sz w:val="21"/>
         </w:rPr>
-        <w:t>"How do you ask for a seller credit without your offer going to the bottom?"</w:t>
+        <w:t>"Why does the rest of the industry miss closing costs as the deal-killer?"</w:t>
       </w:r>
     </w:p>
     <w:p>
@@ -1541,7 +1590,7 @@
         <w:rPr>
           <w:i/>
         </w:rPr>
-        <w:t>"Do you raise the price to cover it? By how much, and what happens if it doesn't appraise?"</w:t>
+        <w:t>"Is it the agents, the lenders, or the buyers who aren't saying it?"</w:t>
       </w:r>
     </w:p>
     <w:p>
@@ -1560,7 +1609,7 @@
         <w:rPr>
           <w:i/>
         </w:rPr>
-        <w:t>The price-up, credit-back mechanics. How he protects the buyer if the appraisal comes in low. What percent he actually asks for.</w:t>
+        <w:t>A contrarian take on who drops the ball.</w:t>
       </w:r>
     </w:p>
     <w:p>
@@ -1579,26 +1628,7 @@
         <w:rPr>
           <w:i/>
         </w:rPr>
-        <w:t>Individual agents.</w:t>
-      </w:r>
-    </w:p>
-    <w:p>
-      <w:pPr>
-        <w:spacing w:after="40"/>
-      </w:pPr>
-      <w:r>
-        <w:rPr>
-          <w:b/>
-          <w:i w:val="0"/>
-        </w:rPr>
-        <w:t xml:space="preserve">PRODUCER NOTE: </w:t>
-      </w:r>
-      <w:r>
-        <w:rPr>
-          <w:b w:val="0"/>
-          <w:i/>
-        </w:rPr>
-        <w:t>Do not accept "it depends." Ask for the last deal: price, credit amount, appraisal.</w:t>
+        <w:t>Individual agents, team leaders.</w:t>
       </w:r>
     </w:p>
     <w:p>
@@ -1622,7 +1652,7 @@
           <w:b/>
           <w:i w:val="0"/>
         </w:rPr>
-        <w:t>I've interviewed hundreds of agents on this show, and almost none of them has named closing costs as the reason a first-time buyer didn't buy. You're saying it's one of the most common ones in your world. Why does the rest of the industry miss it?</w:t>
+        <w:t>There's a listing agent listening right now, 20 years in, who reads any offer with a seller credit or a down payment assistance program as the weak offer. Slower close, more conditions, more likely to fall apart. Talk to that agent directly. What do you want them to know?</w:t>
       </w:r>
     </w:p>
     <w:p>
@@ -1643,7 +1673,7 @@
           <w:b/>
           <w:sz w:val="21"/>
         </w:rPr>
-        <w:t>"Why does the rest of the industry miss closing costs as the deal-killer?"</w:t>
+        <w:t>"Talk to the listing agent who thinks assistance offers are weak. What should they know?"</w:t>
       </w:r>
     </w:p>
     <w:p>
@@ -1662,7 +1692,7 @@
         <w:rPr>
           <w:i/>
         </w:rPr>
-        <w:t>"Is it the agents, the lenders, or the buyers who aren't saying it?"</w:t>
+        <w:t>"Has one of those deals ever fallen apart on you? What happened?"</w:t>
       </w:r>
     </w:p>
     <w:p>
@@ -1681,7 +1711,7 @@
         <w:rPr>
           <w:i/>
         </w:rPr>
-        <w:t>A contrarian take on who drops the ball. Ideally a specific moment where he saw an agent or lender miss it.</w:t>
+        <w:t>The objection answered head-on. Real timelines for assistance closes. How he makes his buyer's offer look as safe as a conventional one.</w:t>
       </w:r>
     </w:p>
     <w:p>
@@ -1700,7 +1730,7 @@
         <w:rPr>
           <w:i/>
         </w:rPr>
-        <w:t>Individual agents, team leaders.</w:t>
+        <w:t>Listing agents, broker-owners.</w:t>
       </w:r>
     </w:p>
     <w:p>
@@ -1724,7 +1754,7 @@
           <w:b/>
           <w:i w:val="0"/>
         </w:rPr>
-        <w:t>There's a listing agent listening right now, 20 years in, who reads any offer with a seller credit or a down payment assistance program as the weak offer. Slower close, more conditions, more likely to fall apart. Talk to that agent directly. What do you want them to know?</w:t>
+        <w:t>The City of LA's LIPA program lists up to $161,000 for low-income first-time buyers, no monthly payment. But it isn't free money. It takes a share of the appreciation when they sell or refinance. How do you explain that trade to a first-generation buyer, and have you ever told someone not to take it?</w:t>
       </w:r>
     </w:p>
     <w:p>
@@ -1745,7 +1775,7 @@
           <w:b/>
           <w:sz w:val="21"/>
         </w:rPr>
-        <w:t>"Talk to the listing agent who thinks DPA offers are weak. What should they know?"</w:t>
+        <w:t>"LA's program lists up to $161,000, but takes a cut of appreciation. How do you explain that?"</w:t>
       </w:r>
     </w:p>
     <w:p>
@@ -1764,7 +1794,7 @@
         <w:rPr>
           <w:i/>
         </w:rPr>
-        <w:t>"Has one of those deals ever fallen apart on you? What happened?"</w:t>
+        <w:t>"What's the math you show them?"</w:t>
       </w:r>
     </w:p>
     <w:p>
@@ -1783,7 +1813,7 @@
         <w:rPr>
           <w:i/>
         </w:rPr>
-        <w:t>The objection answered head-on. Real timelines for DPA closes. What he does to make his buyer's offer look as safe as a conventional one.</w:t>
+        <w:t>Why these programs go unused, and the honest cost on the back end. This is the credibility beat of the episode.</w:t>
       </w:r>
     </w:p>
     <w:p>
@@ -1802,7 +1832,26 @@
         <w:rPr>
           <w:i/>
         </w:rPr>
-        <w:t>Listing agents, broker-owners.</w:t>
+        <w:t>Individual agents, new agents.</w:t>
+      </w:r>
+    </w:p>
+    <w:p>
+      <w:pPr>
+        <w:spacing w:after="40"/>
+      </w:pPr>
+      <w:r>
+        <w:rPr>
+          <w:b/>
+          <w:i w:val="0"/>
+        </w:rPr>
+        <w:t xml:space="preserve">PRODUCER NOTE: </w:t>
+      </w:r>
+      <w:r>
+        <w:rPr>
+          <w:b w:val="0"/>
+          <w:i/>
+        </w:rPr>
+        <w:t>Say "lists up to." City of LA only, 1-unit homes, income limits apply. If he goes long on program details, ask for one buyer.</w:t>
       </w:r>
     </w:p>
     <w:p>
@@ -1826,7 +1875,7 @@
           <w:b/>
           <w:i w:val="0"/>
         </w:rPr>
-        <w:t>Since the NAR settlement, buyer's agents are often asking the seller to cover their commission too. Does that ever end up competing with the buyer's closing-cost credit for the same seller dollars, and how do you handle it?</w:t>
+        <w:t>Give the listener the actual words. When you call the listing agent before you send an offer asking for a credit, what do you say?</w:t>
       </w:r>
     </w:p>
     <w:p>
@@ -1847,26 +1896,7 @@
           <w:b/>
           <w:sz w:val="21"/>
         </w:rPr>
-        <w:t>"Since the settlement, do your commission and the buyer's credit fight for the same seller money?"</w:t>
-      </w:r>
-    </w:p>
-    <w:p>
-      <w:pPr>
-        <w:pStyle w:val="IntenseQuote"/>
-        <w:spacing w:after="60" w:before="60"/>
-      </w:pPr>
-      <w:r>
-        <w:rPr>
-          <w:b/>
-          <w:i/>
-        </w:rPr>
-        <w:t xml:space="preserve">First, say this: </w:t>
-      </w:r>
-      <w:r>
-        <w:rPr>
-          <w:i/>
-        </w:rPr>
-        <w:t>"Do you mind if I ask about your own pay here?"</w:t>
+        <w:t>"What do you say to the listing agent before you send an offer with a credit?"</w:t>
       </w:r>
     </w:p>
     <w:p>
@@ -1885,7 +1915,7 @@
         <w:rPr>
           <w:i/>
         </w:rPr>
-        <w:t>"Walk me through the last deal where both were on the table."</w:t>
+        <w:t>"And what do you say when they tell you the seller won't do credits?"</w:t>
       </w:r>
     </w:p>
     <w:p>
@@ -1904,7 +1934,7 @@
         <w:rPr>
           <w:i/>
         </w:rPr>
-        <w:t>Whether his pay and his buyer's credit compete, and how he prioritizes. How he explains it to the buyer.</w:t>
+        <w:t>A script the listener can use on their next offer.</w:t>
       </w:r>
     </w:p>
     <w:p>
@@ -1923,32 +1953,83 @@
         <w:rPr>
           <w:i/>
         </w:rPr>
-        <w:t>Individual agents, broker-owners.</w:t>
+        <w:t>Individual agents, new agents.</w:t>
       </w:r>
     </w:p>
     <w:p>
       <w:pPr>
-        <w:spacing w:after="40"/>
+        <w:spacing w:after="0"/>
+      </w:pPr>
+    </w:p>
+    <w:p>
+      <w:pPr>
+        <w:spacing w:after="120"/>
       </w:pPr>
       <w:r>
         <w:rPr>
           <w:b/>
           <w:i w:val="0"/>
         </w:rPr>
-        <w:t xml:space="preserve">PRODUCER NOTE: </w:t>
+        <w:t xml:space="preserve">BRIDGE TO NEXT BLOCK (read as written): </w:t>
       </w:r>
       <w:r>
         <w:rPr>
           <w:b w:val="0"/>
           <w:i/>
         </w:rPr>
-        <w:t>Do not state a rule on whether seller-paid commission counts toward the concession cap. Lender guidance varies. Let him explain what he has seen.</w:t>
+        <w:t>"So the money is there, and most agents never mention it. But these buyers aren't out looking for an agent. They've already decided they can't buy. So how do you find them? That's where ten years in marketing comes in."</w:t>
       </w:r>
     </w:p>
     <w:p>
       <w:pPr>
-        <w:spacing w:after="0"/>
-      </w:pPr>
+        <w:pStyle w:val="Heading2"/>
+      </w:pPr>
+      <w:r>
+        <w:t>BLOCK 3: Finding the Buyer Who Isn't Looking (21:00 to 31:00)</w:t>
+      </w:r>
+    </w:p>
+    <w:p>
+      <w:pPr>
+        <w:spacing w:after="40"/>
+      </w:pPr>
+      <w:r>
+        <w:rPr>
+          <w:b w:val="0"/>
+          <w:i/>
+        </w:rPr>
+        <w:t>Audience note: individual agents, plus broker-owners on Q10. This is the "how do I find them" half of the core topic, which is where his marketing background earns its place.</w:t>
+      </w:r>
+    </w:p>
+    <w:p>
+      <w:pPr>
+        <w:spacing w:after="120"/>
+      </w:pPr>
+      <w:r>
+        <w:rPr>
+          <w:b w:val="0"/>
+          <w:i w:val="0"/>
+        </w:rPr>
+        <w:t>Arc: the message, the language, the search, the free listing.</w:t>
+      </w:r>
+    </w:p>
+    <w:p>
+      <w:pPr>
+        <w:spacing w:after="120"/>
+      </w:pPr>
+      <w:r>
+        <w:rPr>
+          <w:b/>
+          <w:i w:val="0"/>
+        </w:rPr>
+        <w:t xml:space="preserve">Source: </w:t>
+      </w:r>
+      <w:r>
+        <w:rPr>
+          <w:b w:val="0"/>
+          <w:i/>
+        </w:rPr>
+        <w:t>Q9 through Q12 are adapted from the questions Alex sent. See 4I for which ones we used and why.</w:t>
+      </w:r>
     </w:p>
     <w:p>
       <w:pPr>
@@ -1966,7 +2047,7 @@
           <w:b/>
           <w:i w:val="0"/>
         </w:rPr>
-        <w:t>Give the listener the actual words. When you call the listing agent before you send an offer asking for a credit, what do you say?</w:t>
+        <w:t>You spent about ten years building lead generation for law firms before you got your license. A lot of your buyers can cover the down payment and not the closing costs. How do you use that in your marketing, when the person you're trying to reach has already decided they can't buy?</w:t>
       </w:r>
     </w:p>
     <w:p>
@@ -1987,7 +2068,7 @@
           <w:b/>
           <w:sz w:val="21"/>
         </w:rPr>
-        <w:t>"What do you say to the listing agent before you send an offer with a credit?"</w:t>
+        <w:t>"How do you market to a buyer who's already decided they can't buy?"</w:t>
       </w:r>
     </w:p>
     <w:p>
@@ -2006,7 +2087,7 @@
         <w:rPr>
           <w:i/>
         </w:rPr>
-        <w:t>"And what do you say when they tell you the seller won't do credits?"</w:t>
+        <w:t>"Show me an actual post or ad. What did it say, and what happened?"</w:t>
       </w:r>
     </w:p>
     <w:p>
@@ -2025,7 +2106,7 @@
         <w:rPr>
           <w:i/>
         </w:rPr>
-        <w:t>A script the listener can use on their next offer.</w:t>
+        <w:t>The message that reaches a self-disqualified buyer. One real piece of content and its result.</w:t>
       </w:r>
     </w:p>
     <w:p>
@@ -2044,64 +2125,13 @@
         <w:rPr>
           <w:i/>
         </w:rPr>
-        <w:t>Individual agents, new agents.</w:t>
+        <w:t>Individual agents.</w:t>
       </w:r>
     </w:p>
     <w:p>
       <w:pPr>
         <w:spacing w:after="0"/>
       </w:pPr>
-    </w:p>
-    <w:p>
-      <w:pPr>
-        <w:spacing w:after="120"/>
-      </w:pPr>
-      <w:r>
-        <w:rPr>
-          <w:b/>
-          <w:i w:val="0"/>
-        </w:rPr>
-        <w:t xml:space="preserve">BRIDGE TO NEXT BLOCK (read as written): </w:t>
-      </w:r>
-      <w:r>
-        <w:rPr>
-          <w:b w:val="0"/>
-          <w:i/>
-        </w:rPr>
-        <w:t>"The seller can cover part of the gap. For a lot of your buyers the rest comes from programs most agents have never even opened, so let's go there."</w:t>
-      </w:r>
-    </w:p>
-    <w:p>
-      <w:pPr>
-        <w:pStyle w:val="Heading2"/>
-      </w:pPr>
-      <w:r>
-        <w:t>BLOCK 3: The Programs Nobody Told Them About (22:00 to 31:00)</w:t>
-      </w:r>
-    </w:p>
-    <w:p>
-      <w:pPr>
-        <w:spacing w:after="40"/>
-      </w:pPr>
-      <w:r>
-        <w:rPr>
-          <w:b w:val="0"/>
-          <w:i/>
-        </w:rPr>
-        <w:t>Audience note: individual agents in every market. The LA numbers are the example; the process is the takeaway.</w:t>
-      </w:r>
-    </w:p>
-    <w:p>
-      <w:pPr>
-        <w:spacing w:after="120"/>
-      </w:pPr>
-      <w:r>
-        <w:rPr>
-          <w:b w:val="0"/>
-          <w:i w:val="0"/>
-        </w:rPr>
-        <w:t>Arc: the number, the catch, your market.</w:t>
-      </w:r>
     </w:p>
     <w:p>
       <w:pPr>
@@ -2119,7 +2149,7 @@
           <w:b/>
           <w:i w:val="0"/>
         </w:rPr>
-        <w:t>The City of LA's LIPA program lists up to $161,000 for low-income first-time buyers, with no monthly payment. That's a real number. Why aren't more buyers using it, and why aren't more agents bringing it up?</w:t>
+        <w:t>You work a lot with the Hispanic community in South, East and Northeast LA and Long Beach. What does bilingual marketing involve beyond translating your posts?</w:t>
       </w:r>
     </w:p>
     <w:p>
@@ -2140,7 +2170,7 @@
           <w:b/>
           <w:sz w:val="21"/>
         </w:rPr>
-        <w:t>"LA lists up to $161,000 in buyer assistance. Why isn't everybody using it?"</w:t>
+        <w:t>"What does bilingual marketing involve beyond translating posts?"</w:t>
       </w:r>
     </w:p>
     <w:p>
@@ -2159,7 +2189,7 @@
         <w:rPr>
           <w:i/>
         </w:rPr>
-        <w:t>"How many of your buyers have actually closed with one of these programs?"</w:t>
+        <w:t>"What's something that works in English and falls flat in Spanish, or the other way around?"</w:t>
       </w:r>
     </w:p>
     <w:p>
@@ -2178,7 +2208,7 @@
         <w:rPr>
           <w:i/>
         </w:rPr>
-        <w:t>The real reasons: income limits, city-only boundaries, slow timelines, lenders who don't offer it, agents who don't know it exists. A real count from him.</w:t>
+        <w:t>What serving Spanish-speaking and first-gen buyers really takes: family decision-making, trust, education before the ask. Not generalizations about a whole community.</w:t>
       </w:r>
     </w:p>
     <w:p>
@@ -2197,7 +2227,7 @@
         <w:rPr>
           <w:i/>
         </w:rPr>
-        <w:t>Individual agents, new agents.</w:t>
+        <w:t>Individual agents, team leaders, broker-owners.</w:t>
       </w:r>
     </w:p>
     <w:p>
@@ -2216,7 +2246,7 @@
           <w:b w:val="0"/>
           <w:i/>
         </w:rPr>
-        <w:t>Say "lists up to." City of LA only, 1-unit homes, income limits apply.</w:t>
+        <w:t>Perspective flip. If there's time, add: "And for the broker who thinks one bilingual agent solves it?"</w:t>
       </w:r>
     </w:p>
     <w:p>
@@ -2240,7 +2270,7 @@
           <w:b/>
           <w:i w:val="0"/>
         </w:rPr>
-        <w:t>These programs aren't free money. LIPA and the county program take a share of the appreciation when the buyer sells or refinances. How do you explain that to a first-generation buyer without scaring them off, and have you ever told someone not to take it?</w:t>
+        <w:t>You've done SEO for personal injury law firms, one of the most competitive markets online. In plain English, what does SEO mean for a real estate agent, what carries over from law, and how long before it works?</w:t>
       </w:r>
     </w:p>
     <w:p>
@@ -2261,7 +2291,7 @@
           <w:b/>
           <w:sz w:val="21"/>
         </w:rPr>
-        <w:t>"These loans take a cut of the appreciation. How do you explain that honestly?"</w:t>
+        <w:t>"What carries over from law firm SEO to real estate, and how long does it take?"</w:t>
       </w:r>
     </w:p>
     <w:p>
@@ -2280,7 +2310,7 @@
         <w:rPr>
           <w:i/>
         </w:rPr>
-        <w:t>"What's the math you show them?"</w:t>
+        <w:t>"Give me a number. Months? A year?"</w:t>
       </w:r>
     </w:p>
     <w:p>
@@ -2299,7 +2329,7 @@
         <w:rPr>
           <w:i/>
         </w:rPr>
-        <w:t>The honest cost of assistance. Whether he has talked a buyer out of a program. This is the credibility beat of the episode.</w:t>
+        <w:t>SEO in one sentence, the one PI-law lesson that transfers, and a real timeline so agents don't quit after six weeks.</w:t>
       </w:r>
     </w:p>
     <w:p>
@@ -2323,6 +2353,25 @@
     </w:p>
     <w:p>
       <w:pPr>
+        <w:spacing w:after="40"/>
+      </w:pPr>
+      <w:r>
+        <w:rPr>
+          <w:b/>
+          <w:i w:val="0"/>
+        </w:rPr>
+        <w:t xml:space="preserve">PRODUCER NOTE: </w:t>
+      </w:r>
+      <w:r>
+        <w:rPr>
+          <w:b w:val="0"/>
+          <w:i/>
+        </w:rPr>
+        <w:t>Product rule. If this becomes a pitch, ask "and for the agent doing it alone with no budget?"</w:t>
+      </w:r>
+    </w:p>
+    <w:p>
+      <w:pPr>
         <w:spacing w:after="0"/>
       </w:pPr>
     </w:p>
@@ -2342,7 +2391,7 @@
           <w:b/>
           <w:i w:val="0"/>
         </w:rPr>
-        <w:t>Most of our listeners aren't in LA. If an agent in Chicago or Dallas wants to know what's available for their buyers by Friday, where do they start, and who do they call?</w:t>
+        <w:t>Why do so many agents skip their Google Business Profile, and what should they fix first?</w:t>
       </w:r>
     </w:p>
     <w:p>
@@ -2363,7 +2412,7 @@
           <w:b/>
           <w:sz w:val="21"/>
         </w:rPr>
-        <w:t>"An agent outside LA wants to know their local programs by Friday. Where do they start?"</w:t>
+        <w:t>"Why do agents skip their Google Business Profile, and what do they fix first?"</w:t>
       </w:r>
     </w:p>
     <w:p>
@@ -2382,7 +2431,7 @@
         <w:rPr>
           <w:i/>
         </w:rPr>
-        <w:t>"Is it the lender, the city housing department, or the state housing agency first?"</w:t>
+        <w:t>"If a listener opens theirs right after this episode, what's the first field they change?"</w:t>
       </w:r>
     </w:p>
     <w:p>
@@ -2401,7 +2450,7 @@
         <w:rPr>
           <w:i/>
         </w:rPr>
-        <w:t>A repeatable research process any agent can run: city, county, state, and which lenders actually originate these loans.</w:t>
+        <w:t>The single highest-leverage free listing and the exact first fix.</w:t>
       </w:r>
     </w:p>
     <w:p>
@@ -2420,7 +2469,7 @@
         <w:rPr>
           <w:i/>
         </w:rPr>
-        <w:t>Individual agents in every market.</w:t>
+        <w:t>Individual agents, new agents.</w:t>
       </w:r>
     </w:p>
     <w:p>
@@ -2444,7 +2493,7 @@
           <w:b w:val="0"/>
           <w:i/>
         </w:rPr>
-        <w:t>"So the money is there and most agents never mention it. The last piece is how you find these buyers in the first place, and that's where your marketing background comes in."</w:t>
+        <w:t>"So you market to the buyer before they think they're a buyer. Now let's make it practical for the agent listening with no budget, and I want to go back to something you said at the very top."</w:t>
       </w:r>
     </w:p>
     <w:p>
@@ -2452,7 +2501,7 @@
         <w:pStyle w:val="Heading2"/>
       </w:pPr>
       <w:r>
-        <w:t>BLOCK 4: Fewer Calls, Better Calls (31:00 to 40:00)</w:t>
+        <w:t>BLOCK 4: Fewer Calls, Better Marketing (31:00 to 40:00)</w:t>
       </w:r>
     </w:p>
     <w:p>
@@ -2464,7 +2513,7 @@
           <w:b w:val="0"/>
           <w:i/>
         </w:rPr>
-        <w:t>Audience note: individual agents who are grinding on volume and not converting. Also team leaders and broker-owners on Q16.</w:t>
+        <w:t>Audience note: individual agents grinding on volume and not converting, and new agents with time but no money.</w:t>
       </w:r>
     </w:p>
     <w:p>
@@ -2476,7 +2525,7 @@
           <w:b w:val="0"/>
           <w:i w:val="0"/>
         </w:rPr>
-        <w:t>Arc: the callback, the system, the mistake, the brokerage, the cut.</w:t>
+        <w:t>Arc: the callback, the audit, the mistake, the scoreboard, the five hours.</w:t>
       </w:r>
     </w:p>
     <w:p>
@@ -2554,7 +2603,7 @@
         <w:rPr>
           <w:i/>
         </w:rPr>
-        <w:t>His actual weekly cadence. What practice, reading and script work look like in hours. How that shows up in conversion.</w:t>
+        <w:t>His weekly cadence. What practice, reading and script work look like in hours.</w:t>
       </w:r>
     </w:p>
     <w:p>
@@ -2597,7 +2646,7 @@
           <w:b/>
           <w:i w:val="0"/>
         </w:rPr>
-        <w:t>Your marketing agency's site says, 'You don't have a lead problem. You have a system problem.' Apply that to your own real estate business. Where do your first-generation buyers actually come from, and what happens in the first hour after one raises their hand?</w:t>
+        <w:t>When you look at an agent's online presence for the first time, what are you checking, and what's usually broken?</w:t>
       </w:r>
     </w:p>
     <w:p>
@@ -2618,7 +2667,7 @@
           <w:b/>
           <w:sz w:val="21"/>
         </w:rPr>
-        <w:t>"Where do your first-gen buyers come from, and what happens in the first hour?"</w:t>
+        <w:t>"When you look at an agent online for the first time, what's usually broken?"</w:t>
       </w:r>
     </w:p>
     <w:p>
@@ -2637,7 +2686,7 @@
         <w:rPr>
           <w:i/>
         </w:rPr>
-        <w:t>"Which channel brought you your last three buyers?"</w:t>
+        <w:t>"What's one fix a listener could make today, before they go to bed?"</w:t>
       </w:r>
     </w:p>
     <w:p>
@@ -2656,7 +2705,7 @@
         <w:rPr>
           <w:i/>
         </w:rPr>
-        <w:t>Real lead sources (Spanish-language content, Google, sphere, referrals). His speed-to-lead and follow-up system. No agency pitch.</w:t>
+        <w:t>His audit checklist, out loud: site, Google profile, portals, reviews, follow-up. Plus one fix for today.</w:t>
       </w:r>
     </w:p>
     <w:p>
@@ -2694,7 +2743,7 @@
           <w:b w:val="0"/>
           <w:i/>
         </w:rPr>
-        <w:t>Product rule. If this becomes a pitch for Maldonado Marketing, ask "and for the agent doing this alone with no budget?"</w:t>
+        <w:t>This is his audit, given away free on air. Good. Do not mention the paid version here; that happens once, in the close.</w:t>
       </w:r>
     </w:p>
     <w:p>
@@ -2820,7 +2869,7 @@
           <w:b/>
           <w:i w:val="0"/>
         </w:rPr>
-        <w:t>For the broker or team leader who wants to serve Spanish-speaking buyers and thinks the answer is one bilingual agent and a translated website: what are they getting wrong?</w:t>
+        <w:t>How do you know if your marketing is actually working, beyond likes and followers?</w:t>
       </w:r>
     </w:p>
     <w:p>
@@ -2841,7 +2890,7 @@
           <w:b/>
           <w:sz w:val="21"/>
         </w:rPr>
-        <w:t>"What do brokerages get wrong about serving Spanish-speaking buyers?"</w:t>
+        <w:t>"How do you know your marketing is working, beyond likes and followers?"</w:t>
       </w:r>
     </w:p>
     <w:p>
@@ -2860,7 +2909,7 @@
         <w:rPr>
           <w:i/>
         </w:rPr>
-        <w:t>"What would you build if you ran the brokerage?"</w:t>
+        <w:t>"What number do you check every week?"</w:t>
       </w:r>
     </w:p>
     <w:p>
@@ -2879,7 +2928,7 @@
         <w:rPr>
           <w:i/>
         </w:rPr>
-        <w:t>What serving the Hispanic and first-gen market really takes: trust, family decision-making, Spanish-language education, partner lenders.</w:t>
+        <w:t>The one or two numbers that matter (conversations, appointments, source of each closing) and how he tracks them.</w:t>
       </w:r>
     </w:p>
     <w:p>
@@ -2898,7 +2947,7 @@
         <w:rPr>
           <w:i/>
         </w:rPr>
-        <w:t>Broker-owners, team leaders.</w:t>
+        <w:t>Individual agents, team leaders.</w:t>
       </w:r>
     </w:p>
     <w:p>
@@ -2922,7 +2971,7 @@
           <w:b/>
           <w:i w:val="0"/>
         </w:rPr>
-        <w:t>The listener who's making 50 calls a day and closing nothing: what should they cut this week, and what do they do with that hour instead?</w:t>
+        <w:t>The agent listening has no budget and five hours a week. Where should those five hours go?</w:t>
       </w:r>
     </w:p>
     <w:p>
@@ -2943,7 +2992,7 @@
           <w:b/>
           <w:sz w:val="21"/>
         </w:rPr>
-        <w:t>"The agent making 50 calls a day and closing nothing: what should they cut?"</w:t>
+        <w:t>"No budget, five hours a week. Where should that time go?"</w:t>
       </w:r>
     </w:p>
     <w:p>
@@ -2981,7 +3030,7 @@
         <w:rPr>
           <w:i/>
         </w:rPr>
-        <w:t>A concrete swap: fewer dials, one hour of script practice or targeted follow-up. The do-it-tomorrow for the whole episode.</w:t>
+        <w:t>A concrete weekly plan. Ideally ties back to the numbers-game answer: fewer dials, more practice, one marketing asset. The do-it-tomorrow for the whole episode.</w:t>
       </w:r>
     </w:p>
     <w:p>
@@ -3050,7 +3099,7 @@
         <w:spacing w:after="40"/>
       </w:pPr>
       <w:r>
-        <w:t>"Alex, where can people find you?" Expect alexmaldonadorealestate.com and Instagram @yourrealestateman.alex.</w:t>
+        <w:t>"Alex, where can people find you, and where can agents go if they want you to look at their marketing?"</w:t>
       </w:r>
     </w:p>
     <w:p>
@@ -3059,7 +3108,43 @@
         <w:spacing w:after="40"/>
       </w:pPr>
       <w:r>
-        <w:t>Listener resource: his free Down Payment Assistance guide and First-Time Buyer's Roadmap on his site. Ask him to name them. Useful mostly to LA listeners, so frame it as "if you have a client moving to LA."</w:t>
+        <w:rPr>
+          <w:b/>
+        </w:rPr>
+        <w:t xml:space="preserve">Buyers: </w:t>
+      </w:r>
+      <w:r>
+        <w:t>alexmaldonadorealestate.com and Instagram @yourrealestateman.alex. His free Down Payment Assistance guide and First-Time Buyer's Roadmap are on the site.</w:t>
+      </w:r>
+    </w:p>
+    <w:p>
+      <w:pPr>
+        <w:pStyle w:val="ListBullet"/>
+        <w:spacing w:after="40"/>
+      </w:pPr>
+      <w:r>
+        <w:rPr>
+          <w:b/>
+        </w:rPr>
+        <w:t xml:space="preserve">Agents: </w:t>
+      </w:r>
+      <w:r>
+        <w:t>Free marketing audit at maldonadomarketing.co/agents. Goes in the show notes (Alex asked). Mention it once, here, and nowhere else in the episode.</w:t>
+      </w:r>
+    </w:p>
+    <w:p>
+      <w:pPr>
+        <w:pStyle w:val="ListBullet"/>
+        <w:spacing w:after="40"/>
+      </w:pPr>
+      <w:r>
+        <w:rPr>
+          <w:b/>
+        </w:rPr>
+        <w:t xml:space="preserve">Check before you go live: </w:t>
+      </w:r>
+      <w:r>
+        <w:t>the audit page is written for Los Angeles agents. Most of the audience is not in LA. Ask Alex in the green room whether he takes agents from other markets, so he doesn't get a flood of Chicago requests he can't serve, and so you don't promise something he won't deliver.</w:t>
       </w:r>
     </w:p>
     <w:p>
@@ -3167,7 +3252,7 @@
               <w:rPr>
                 <w:sz w:val="19"/>
               </w:rPr>
-              <w:t>Smallest audience segment, and Q14 already covers how he finds these buyers.</w:t>
+              <w:t>Useful but generic. Q13 and Q17 cover the same ground.</w:t>
             </w:r>
           </w:p>
         </w:tc>
@@ -3197,7 +3282,7 @@
               <w:rPr>
                 <w:sz w:val="19"/>
               </w:rPr>
-              <w:t>Q8</w:t>
+              <w:t>Q11</w:t>
             </w:r>
           </w:p>
         </w:tc>
@@ -3211,7 +3296,7 @@
               <w:rPr>
                 <w:sz w:val="19"/>
               </w:rPr>
-              <w:t>Highest drift risk. Commission talk can eat five minutes and pull off the buyer.</w:t>
+              <w:t>SEO takes longest to answer and is least actionable this week. Q12 is the faster version.</w:t>
             </w:r>
           </w:p>
         </w:tc>
@@ -3241,7 +3326,7 @@
               <w:rPr>
                 <w:sz w:val="19"/>
               </w:rPr>
-              <w:t>Q4</w:t>
+              <w:t>Q5</w:t>
             </w:r>
           </w:p>
         </w:tc>
@@ -3255,7 +3340,7 @@
               <w:rPr>
                 <w:sz w:val="19"/>
               </w:rPr>
-              <w:t>If Q2 produced his exact discovery question, Q4 is already answered.</w:t>
+              <w:t>Moves the "hundreds" line. If you cut it, skip the line this episode.</w:t>
             </w:r>
           </w:p>
         </w:tc>
@@ -3285,7 +3370,7 @@
               <w:rPr>
                 <w:sz w:val="19"/>
               </w:rPr>
-              <w:t>Q12</w:t>
+              <w:t>Q10</w:t>
             </w:r>
           </w:p>
         </w:tc>
@@ -3299,7 +3384,7 @@
               <w:rPr>
                 <w:sz w:val="19"/>
               </w:rPr>
-              <w:t>Useful but generic. Fold it into the homework instead.</w:t>
+              <w:t>Strong, but the smallest audience segment gets the most from it.</w:t>
             </w:r>
           </w:p>
         </w:tc>
@@ -3333,7 +3418,7 @@
         <w:spacing w:after="40"/>
       </w:pPr>
       <w:r>
-        <w:t>Q5, the seller credit mechanics. The most usable answer in the episode.</w:t>
+        <w:t>Q4, the seller credit mechanics. The most usable answer in the episode.</w:t>
       </w:r>
     </w:p>
     <w:p>
@@ -3342,7 +3427,7 @@
         <w:spacing w:after="40"/>
       </w:pPr>
       <w:r>
-        <w:t>Q7, the objection said out loud.</w:t>
+        <w:t>Q6, the objection said out loud.</w:t>
       </w:r>
     </w:p>
     <w:p>
@@ -3351,7 +3436,7 @@
         <w:spacing w:after="40"/>
       </w:pPr>
       <w:r>
-        <w:t>Q11, the honest cost of assistance. It's what makes him credible.</w:t>
+        <w:t>Q9, the bridge between the money and the marketing. Without it, the episode becomes two interviews.</w:t>
       </w:r>
     </w:p>
     <w:p>
@@ -3557,7 +3642,7 @@
               <w:rPr>
                 <w:sz w:val="19"/>
               </w:rPr>
-              <w:t>DRE #02196988. License issue date not found. Ask when he got licensed.</w:t>
+              <w:t>DRE #02196988. He says he got licensed after about ten years in marketing. License date not found; ask.</w:t>
             </w:r>
           </w:p>
         </w:tc>
@@ -4842,6 +4927,614 @@
         <w:pStyle w:val="Heading2"/>
       </w:pPr>
       <w:r>
+        <w:t>4I. Alex's Suggested Questions: What We Used</w:t>
+      </w:r>
+    </w:p>
+    <w:p>
+      <w:pPr>
+        <w:spacing w:after="120"/>
+      </w:pPr>
+      <w:r>
+        <w:rPr>
+          <w:b w:val="0"/>
+          <w:i/>
+        </w:rPr>
+        <w:t>He sent 18. We kept the ones that serve the core topic or give the listener something to do this week, and dropped the ones that overlap or drift into an agency consultation.</w:t>
+      </w:r>
+    </w:p>
+    <w:tbl>
+      <w:tblPr>
+        <w:tblStyle w:val="LightGrid-Accent1"/>
+        <w:tblW w:type="auto" w:w="0"/>
+        <w:tblLook w:firstColumn="1" w:firstRow="1" w:lastColumn="0" w:lastRow="0" w:noHBand="0" w:noVBand="1" w:val="04A0"/>
+      </w:tblPr>
+      <w:tblGrid>
+        <w:gridCol w:w="4968"/>
+        <w:gridCol w:w="4968"/>
+      </w:tblGrid>
+      <w:tr>
+        <w:tc>
+          <w:tcPr>
+            <w:tcW w:type="dxa" w:w="4320"/>
+          </w:tcPr>
+          <w:p>
+            <w:r/>
+            <w:r>
+              <w:rPr>
+                <w:b/>
+                <w:sz w:val="19"/>
+              </w:rPr>
+              <w:t>His question</w:t>
+            </w:r>
+          </w:p>
+        </w:tc>
+        <w:tc>
+          <w:tcPr>
+            <w:tcW w:type="dxa" w:w="5832"/>
+          </w:tcPr>
+          <w:p>
+            <w:r/>
+            <w:r>
+              <w:rPr>
+                <w:b/>
+                <w:sz w:val="19"/>
+              </w:rPr>
+              <w:t>Where it went</w:t>
+            </w:r>
+          </w:p>
+        </w:tc>
+      </w:tr>
+      <w:tr>
+        <w:tc>
+          <w:tcPr>
+            <w:tcW w:type="dxa" w:w="4320"/>
+          </w:tcPr>
+          <w:p>
+            <w:r/>
+            <w:r>
+              <w:rPr>
+                <w:sz w:val="19"/>
+              </w:rPr>
+              <w:t>Why real estate after 10 years in lead gen?</w:t>
+            </w:r>
+          </w:p>
+        </w:tc>
+        <w:tc>
+          <w:tcPr>
+            <w:tcW w:type="dxa" w:w="5832"/>
+          </w:tcPr>
+          <w:p>
+            <w:r/>
+            <w:r>
+              <w:rPr>
+                <w:sz w:val="19"/>
+              </w:rPr>
+              <w:t>Folded into Q9 setup. Q1 already covers the why, from a sharper angle.</w:t>
+            </w:r>
+          </w:p>
+        </w:tc>
+      </w:tr>
+      <w:tr>
+        <w:tc>
+          <w:tcPr>
+            <w:tcW w:type="dxa" w:w="4320"/>
+          </w:tcPr>
+          <w:p>
+            <w:r/>
+            <w:r>
+              <w:rPr>
+                <w:sz w:val="19"/>
+              </w:rPr>
+              <w:t>What did marketing give you on day one?</w:t>
+            </w:r>
+          </w:p>
+        </w:tc>
+        <w:tc>
+          <w:tcPr>
+            <w:tcW w:type="dxa" w:w="5832"/>
+          </w:tcPr>
+          <w:p>
+            <w:r/>
+            <w:r>
+              <w:rPr>
+                <w:sz w:val="19"/>
+              </w:rPr>
+              <w:t>Dropped. Covered by Q9 and Q14.</w:t>
+            </w:r>
+          </w:p>
+        </w:tc>
+      </w:tr>
+      <w:tr>
+        <w:tc>
+          <w:tcPr>
+            <w:tcW w:type="dxa" w:w="4320"/>
+          </w:tcPr>
+          <w:p>
+            <w:r/>
+            <w:r>
+              <w:rPr>
+                <w:sz w:val="19"/>
+              </w:rPr>
+              <w:t>Bilingual marketing beyond translating posts</w:t>
+            </w:r>
+          </w:p>
+        </w:tc>
+        <w:tc>
+          <w:tcPr>
+            <w:tcW w:type="dxa" w:w="5832"/>
+          </w:tcPr>
+          <w:p>
+            <w:r/>
+            <w:r>
+              <w:rPr>
+                <w:sz w:val="19"/>
+              </w:rPr>
+              <w:t>Q10, nearly as written.</w:t>
+            </w:r>
+          </w:p>
+        </w:tc>
+      </w:tr>
+      <w:tr>
+        <w:tc>
+          <w:tcPr>
+            <w:tcW w:type="dxa" w:w="4320"/>
+          </w:tcPr>
+          <w:p>
+            <w:r/>
+            <w:r>
+              <w:rPr>
+                <w:sz w:val="19"/>
+              </w:rPr>
+              <w:t>Biggest marketing mistake newer agents make</w:t>
+            </w:r>
+          </w:p>
+        </w:tc>
+        <w:tc>
+          <w:tcPr>
+            <w:tcW w:type="dxa" w:w="5832"/>
+          </w:tcPr>
+          <w:p>
+            <w:r/>
+            <w:r>
+              <w:rPr>
+                <w:sz w:val="19"/>
+              </w:rPr>
+              <w:t>Folded into Q14 (what's usually broken).</w:t>
+            </w:r>
+          </w:p>
+        </w:tc>
+      </w:tr>
+      <w:tr>
+        <w:tc>
+          <w:tcPr>
+            <w:tcW w:type="dxa" w:w="4320"/>
+          </w:tcPr>
+          <w:p>
+            <w:r/>
+            <w:r>
+              <w:rPr>
+                <w:sz w:val="19"/>
+              </w:rPr>
+              <w:t>No budget and five hours a week</w:t>
+            </w:r>
+          </w:p>
+        </w:tc>
+        <w:tc>
+          <w:tcPr>
+            <w:tcW w:type="dxa" w:w="5832"/>
+          </w:tcPr>
+          <w:p>
+            <w:r/>
+            <w:r>
+              <w:rPr>
+                <w:sz w:val="19"/>
+              </w:rPr>
+              <w:t>Q17, as written. Closes the episode.</w:t>
+            </w:r>
+          </w:p>
+        </w:tc>
+      </w:tr>
+      <w:tr>
+        <w:tc>
+          <w:tcPr>
+            <w:tcW w:type="dxa" w:w="4320"/>
+          </w:tcPr>
+          <w:p>
+            <w:r/>
+            <w:r>
+              <w:rPr>
+                <w:sz w:val="19"/>
+              </w:rPr>
+              <w:t>Website vs social vs Zillow/Realtor.com</w:t>
+            </w:r>
+          </w:p>
+        </w:tc>
+        <w:tc>
+          <w:tcPr>
+            <w:tcW w:type="dxa" w:w="5832"/>
+          </w:tcPr>
+          <w:p>
+            <w:r/>
+            <w:r>
+              <w:rPr>
+                <w:sz w:val="19"/>
+              </w:rPr>
+              <w:t>Dropped. Too broad for the runtime. Use as a follow-up on Q14 if he raises it.</w:t>
+            </w:r>
+          </w:p>
+        </w:tc>
+      </w:tr>
+      <w:tr>
+        <w:tc>
+          <w:tcPr>
+            <w:tcW w:type="dxa" w:w="4320"/>
+          </w:tcPr>
+          <w:p>
+            <w:r/>
+            <w:r>
+              <w:rPr>
+                <w:sz w:val="19"/>
+              </w:rPr>
+              <w:t>SEO in plain English, how long it takes</w:t>
+            </w:r>
+          </w:p>
+        </w:tc>
+        <w:tc>
+          <w:tcPr>
+            <w:tcW w:type="dxa" w:w="5832"/>
+          </w:tcPr>
+          <w:p>
+            <w:r/>
+            <w:r>
+              <w:rPr>
+                <w:sz w:val="19"/>
+              </w:rPr>
+              <w:t>Merged with the PI law question into Q11.</w:t>
+            </w:r>
+          </w:p>
+        </w:tc>
+      </w:tr>
+      <w:tr>
+        <w:tc>
+          <w:tcPr>
+            <w:tcW w:type="dxa" w:w="4320"/>
+          </w:tcPr>
+          <w:p>
+            <w:r/>
+            <w:r>
+              <w:rPr>
+                <w:sz w:val="19"/>
+              </w:rPr>
+              <w:t>What carries over from PI law SEO</w:t>
+            </w:r>
+          </w:p>
+        </w:tc>
+        <w:tc>
+          <w:tcPr>
+            <w:tcW w:type="dxa" w:w="5832"/>
+          </w:tcPr>
+          <w:p>
+            <w:r/>
+            <w:r>
+              <w:rPr>
+                <w:sz w:val="19"/>
+              </w:rPr>
+              <w:t>Q11.</w:t>
+            </w:r>
+          </w:p>
+        </w:tc>
+      </w:tr>
+      <w:tr>
+        <w:tc>
+          <w:tcPr>
+            <w:tcW w:type="dxa" w:w="4320"/>
+          </w:tcPr>
+          <w:p>
+            <w:r/>
+            <w:r>
+              <w:rPr>
+                <w:sz w:val="19"/>
+              </w:rPr>
+              <w:t>Why agents skip Google Business Profile</w:t>
+            </w:r>
+          </w:p>
+        </w:tc>
+        <w:tc>
+          <w:tcPr>
+            <w:tcW w:type="dxa" w:w="5832"/>
+          </w:tcPr>
+          <w:p>
+            <w:r/>
+            <w:r>
+              <w:rPr>
+                <w:sz w:val="19"/>
+              </w:rPr>
+              <w:t>Q12, as written.</w:t>
+            </w:r>
+          </w:p>
+        </w:tc>
+      </w:tr>
+      <w:tr>
+        <w:tc>
+          <w:tcPr>
+            <w:tcW w:type="dxa" w:w="4320"/>
+          </w:tcPr>
+          <w:p>
+            <w:r/>
+            <w:r>
+              <w:rPr>
+                <w:sz w:val="19"/>
+              </w:rPr>
+              <w:t>What to post vs what nobody cares about</w:t>
+            </w:r>
+          </w:p>
+        </w:tc>
+        <w:tc>
+          <w:tcPr>
+            <w:tcW w:type="dxa" w:w="5832"/>
+          </w:tcPr>
+          <w:p>
+            <w:r/>
+            <w:r>
+              <w:rPr>
+                <w:sz w:val="19"/>
+              </w:rPr>
+              <w:t>Dropped. Well covered on the show already.</w:t>
+            </w:r>
+          </w:p>
+        </w:tc>
+      </w:tr>
+      <w:tr>
+        <w:tc>
+          <w:tcPr>
+            <w:tcW w:type="dxa" w:w="4320"/>
+          </w:tcPr>
+          <w:p>
+            <w:r/>
+            <w:r>
+              <w:rPr>
+                <w:sz w:val="19"/>
+              </w:rPr>
+              <w:t>When to run paid ads</w:t>
+            </w:r>
+          </w:p>
+        </w:tc>
+        <w:tc>
+          <w:tcPr>
+            <w:tcW w:type="dxa" w:w="5832"/>
+          </w:tcPr>
+          <w:p>
+            <w:r/>
+            <w:r>
+              <w:rPr>
+                <w:sz w:val="19"/>
+              </w:rPr>
+              <w:t>Dropped. Most listeners are the no-budget agent in Q17.</w:t>
+            </w:r>
+          </w:p>
+        </w:tc>
+      </w:tr>
+      <w:tr>
+        <w:tc>
+          <w:tcPr>
+            <w:tcW w:type="dxa" w:w="4320"/>
+          </w:tcPr>
+          <w:p>
+            <w:r/>
+            <w:r>
+              <w:rPr>
+                <w:sz w:val="19"/>
+              </w:rPr>
+              <w:t>How you know marketing is working</w:t>
+            </w:r>
+          </w:p>
+        </w:tc>
+        <w:tc>
+          <w:tcPr>
+            <w:tcW w:type="dxa" w:w="5832"/>
+          </w:tcPr>
+          <w:p>
+            <w:r/>
+            <w:r>
+              <w:rPr>
+                <w:sz w:val="19"/>
+              </w:rPr>
+              <w:t>Q16.</w:t>
+            </w:r>
+          </w:p>
+        </w:tc>
+      </w:tr>
+      <w:tr>
+        <w:tc>
+          <w:tcPr>
+            <w:tcW w:type="dxa" w:w="4320"/>
+          </w:tcPr>
+          <w:p>
+            <w:r/>
+            <w:r>
+              <w:rPr>
+                <w:sz w:val="19"/>
+              </w:rPr>
+              <w:t>What surprised you in your first transactions</w:t>
+            </w:r>
+          </w:p>
+        </w:tc>
+        <w:tc>
+          <w:tcPr>
+            <w:tcW w:type="dxa" w:w="5832"/>
+          </w:tcPr>
+          <w:p>
+            <w:r/>
+            <w:r>
+              <w:rPr>
+                <w:sz w:val="19"/>
+              </w:rPr>
+              <w:t>Dropped. Invites the volume conversation 4H warns against.</w:t>
+            </w:r>
+          </w:p>
+        </w:tc>
+      </w:tr>
+      <w:tr>
+        <w:tc>
+          <w:tcPr>
+            <w:tcW w:type="dxa" w:w="4320"/>
+          </w:tcPr>
+          <w:p>
+            <w:r/>
+            <w:r>
+              <w:rPr>
+                <w:sz w:val="19"/>
+              </w:rPr>
+              <w:t>How you use the closing-cost angle in marketing</w:t>
+            </w:r>
+          </w:p>
+        </w:tc>
+        <w:tc>
+          <w:tcPr>
+            <w:tcW w:type="dxa" w:w="5832"/>
+          </w:tcPr>
+          <w:p>
+            <w:r/>
+            <w:r>
+              <w:rPr>
+                <w:sz w:val="19"/>
+              </w:rPr>
+              <w:t>Q9. The hinge of the whole episode.</w:t>
+            </w:r>
+          </w:p>
+        </w:tc>
+      </w:tr>
+      <w:tr>
+        <w:tc>
+          <w:tcPr>
+            <w:tcW w:type="dxa" w:w="4320"/>
+          </w:tcPr>
+          <w:p>
+            <w:r/>
+            <w:r>
+              <w:rPr>
+                <w:sz w:val="19"/>
+              </w:rPr>
+              <w:t>Balancing marketer and agent</w:t>
+            </w:r>
+          </w:p>
+        </w:tc>
+        <w:tc>
+          <w:tcPr>
+            <w:tcW w:type="dxa" w:w="5832"/>
+          </w:tcPr>
+          <w:p>
+            <w:r/>
+            <w:r>
+              <w:rPr>
+                <w:sz w:val="19"/>
+              </w:rPr>
+              <w:t>Dropped. Low listener value.</w:t>
+            </w:r>
+          </w:p>
+        </w:tc>
+      </w:tr>
+      <w:tr>
+        <w:tc>
+          <w:tcPr>
+            <w:tcW w:type="dxa" w:w="4320"/>
+          </w:tcPr>
+          <w:p>
+            <w:r/>
+            <w:r>
+              <w:rPr>
+                <w:sz w:val="19"/>
+              </w:rPr>
+              <w:t>What you check in an agent's online presence</w:t>
+            </w:r>
+          </w:p>
+        </w:tc>
+        <w:tc>
+          <w:tcPr>
+            <w:tcW w:type="dxa" w:w="5832"/>
+          </w:tcPr>
+          <w:p>
+            <w:r/>
+            <w:r>
+              <w:rPr>
+                <w:sz w:val="19"/>
+              </w:rPr>
+              <w:t>Q14.</w:t>
+            </w:r>
+          </w:p>
+        </w:tc>
+      </w:tr>
+      <w:tr>
+        <w:tc>
+          <w:tcPr>
+            <w:tcW w:type="dxa" w:w="4320"/>
+          </w:tcPr>
+          <w:p>
+            <w:r/>
+            <w:r>
+              <w:rPr>
+                <w:sz w:val="19"/>
+              </w:rPr>
+              <w:t>One quick fix a listener could make today</w:t>
+            </w:r>
+          </w:p>
+        </w:tc>
+        <w:tc>
+          <w:tcPr>
+            <w:tcW w:type="dxa" w:w="5832"/>
+          </w:tcPr>
+          <w:p>
+            <w:r/>
+            <w:r>
+              <w:rPr>
+                <w:sz w:val="19"/>
+              </w:rPr>
+              <w:t>Q14 follow-up.</w:t>
+            </w:r>
+          </w:p>
+        </w:tc>
+      </w:tr>
+      <w:tr>
+        <w:tc>
+          <w:tcPr>
+            <w:tcW w:type="dxa" w:w="4320"/>
+          </w:tcPr>
+          <w:p>
+            <w:r/>
+            <w:r>
+              <w:rPr>
+                <w:sz w:val="19"/>
+              </w:rPr>
+              <w:t>Where agents can get their marketing looked at</w:t>
+            </w:r>
+          </w:p>
+        </w:tc>
+        <w:tc>
+          <w:tcPr>
+            <w:tcW w:type="dxa" w:w="5832"/>
+          </w:tcPr>
+          <w:p>
+            <w:r/>
+            <w:r>
+              <w:rPr>
+                <w:sz w:val="19"/>
+              </w:rPr>
+              <w:t>The close and the show notes.</w:t>
+            </w:r>
+          </w:p>
+        </w:tc>
+      </w:tr>
+    </w:tbl>
+    <w:p>
+      <w:pPr>
+        <w:spacing w:after="40"/>
+      </w:pPr>
+    </w:p>
+    <w:p>
+      <w:pPr>
+        <w:pStyle w:val="Heading2"/>
+      </w:pPr>
+      <w:r>
         <w:t>4H. Landmines</w:t>
       </w:r>
     </w:p>
@@ -5076,7 +5769,7 @@
           <w:b w:val="0"/>
           <w:i w:val="0"/>
         </w:rPr>
-        <w:t>LA REALTOR Alex Maldonado joins D.J. Paris on the Keeping It Real Podcast to break down the closing-cost gap: first-time and first-generation buyers who saved the down payment but not closing costs. Seller credits, FHA and conventional concession limits, and down payment assistance programs like LA's LIPA.</w:t>
+        <w:t>LA REALTOR Alex Maldonado joins D.J. Paris on the Keeping It Real Podcast to break down the closing-cost gap: first-time and first-generation buyers who saved the down payment but not closing costs. Seller credits, FHA and conventional concession limits, down payment assistance programs like LA's LIPA, and how a former law firm marketer finds buyers who aren't looking. Free marketing audit for agents: maldonadomarketing.co/agents</w:t>
       </w:r>
     </w:p>
     <w:p>
@@ -5096,7 +5789,7 @@
           <w:b w:val="0"/>
           <w:i w:val="0"/>
         </w:rPr>
-        <w:t>Most agents lose first-time buyers before they ever meet them, because the buyer decides closing costs make owning impossible. Alex Maldonado, a Los Angeles REALTOR who also runs a law firm marketing agency, joins D.J. Paris to walk through seller credits, assistance programs and how he finds these buyers.</w:t>
+        <w:t>Most agents lose first-time buyers before they ever meet them, because the buyer decides closing costs make owning impossible. Alex Maldonado, a Los Angeles REALTOR who also runs a law firm marketing agency, joins D.J. Paris to walk through seller credits, assistance programs, and the marketing that finds buyers before they think they're buyers.</w:t>
       </w:r>
     </w:p>
     <w:p>
@@ -5134,7 +5827,7 @@
         <w:t xml:space="preserve">Episode: </w:t>
       </w:r>
       <w:r>
-        <w:t>#FirstTimeHomeBuyer #FirstGenHomeBuyer #ClosingCosts #DownPaymentAssistance #LosAngelesRealEstate #LatinoHomeBuyers #SellerCredits</w:t>
+        <w:t>#FirstTimeHomeBuyer #FirstGenHomeBuyer #ClosingCosts #DownPaymentAssistance #LosAngelesRealEstate #LatinoHomeBuyers #SellerCredits #RealEstateMarketing</w:t>
       </w:r>
     </w:p>
     <w:p>
@@ -5150,6 +5843,38 @@
       </w:r>
       <w:r>
         <w:t>Instagram @yourrealestateman.alex. YouTube @yourrealestateman_alex.</w:t>
+      </w:r>
+    </w:p>
+    <w:p>
+      <w:pPr>
+        <w:pStyle w:val="Heading2"/>
+      </w:pPr>
+      <w:r>
+        <w:t>5D. Show Notes Link (Alex requested)</w:t>
+      </w:r>
+    </w:p>
+    <w:p>
+      <w:pPr>
+        <w:spacing w:after="120"/>
+      </w:pPr>
+      <w:r>
+        <w:rPr>
+          <w:b w:val="0"/>
+          <w:i w:val="0"/>
+        </w:rPr>
+        <w:t>Free marketing audit for agents: https://maldonadomarketing.co/agents/</w:t>
+      </w:r>
+    </w:p>
+    <w:p>
+      <w:pPr>
+        <w:spacing w:after="120"/>
+      </w:pPr>
+      <w:r>
+        <w:rPr>
+          <w:b w:val="0"/>
+          <w:i/>
+        </w:rPr>
+        <w:t>Confirm he takes agents outside LA before publishing. If not, label it "for Los Angeles agents."</w:t>
       </w:r>
     </w:p>
     <w:p>
@@ -5303,7 +6028,7 @@
               <w:rPr>
                 <w:sz w:val="19"/>
               </w:rPr>
-              <w:t>~6:00</w:t>
+              <w:t>~5:00</w:t>
             </w:r>
           </w:p>
         </w:tc>
@@ -5333,7 +6058,7 @@
               <w:rPr>
                 <w:sz w:val="19"/>
               </w:rPr>
-              <w:t>~9:00</w:t>
+              <w:t>~8:00</w:t>
             </w:r>
           </w:p>
         </w:tc>
@@ -5363,7 +6088,7 @@
               <w:rPr>
                 <w:sz w:val="19"/>
               </w:rPr>
-              <w:t>~12:00</w:t>
+              <w:t>~10:00</w:t>
             </w:r>
           </w:p>
         </w:tc>
@@ -5393,7 +6118,7 @@
               <w:rPr>
                 <w:sz w:val="19"/>
               </w:rPr>
-              <w:t>~15:00</w:t>
+              <w:t>~13:00</w:t>
             </w:r>
           </w:p>
         </w:tc>
@@ -5423,7 +6148,7 @@
               <w:rPr>
                 <w:sz w:val="19"/>
               </w:rPr>
-              <w:t>~17:00</w:t>
+              <w:t>~15:00</w:t>
             </w:r>
           </w:p>
         </w:tc>
@@ -5453,6 +6178,36 @@
               <w:rPr>
                 <w:sz w:val="19"/>
               </w:rPr>
+              <w:t>~17:00</w:t>
+            </w:r>
+          </w:p>
+        </w:tc>
+        <w:tc>
+          <w:tcPr>
+            <w:tcW w:type="dxa" w:w="8712"/>
+          </w:tcPr>
+          <w:p>
+            <w:r/>
+            <w:r>
+              <w:rPr>
+                <w:sz w:val="19"/>
+              </w:rPr>
+              <w:t>LA's $161,000 Buyer Assistance Program and Its Catch</w:t>
+            </w:r>
+          </w:p>
+        </w:tc>
+      </w:tr>
+      <w:tr>
+        <w:tc>
+          <w:tcPr>
+            <w:tcW w:type="dxa" w:w="1440"/>
+          </w:tcPr>
+          <w:p>
+            <w:r/>
+            <w:r>
+              <w:rPr>
+                <w:sz w:val="19"/>
+              </w:rPr>
               <w:t>~19:00</w:t>
             </w:r>
           </w:p>
@@ -5467,7 +6222,7 @@
               <w:rPr>
                 <w:sz w:val="19"/>
               </w:rPr>
-              <w:t>Buyer Agent Commission vs Closing-Cost Credits After the NAR Settlement</w:t>
+              <w:t>What to Say to the Listing Agent Before Your Offer</w:t>
             </w:r>
           </w:p>
         </w:tc>
@@ -5497,7 +6252,7 @@
               <w:rPr>
                 <w:sz w:val="19"/>
               </w:rPr>
-              <w:t>What to Say to the Listing Agent Before Your Offer</w:t>
+              <w:t>How to Market to Buyers Who Think They Can't Buy</w:t>
             </w:r>
           </w:p>
         </w:tc>
@@ -5513,7 +6268,7 @@
               <w:rPr>
                 <w:sz w:val="19"/>
               </w:rPr>
-              <w:t>~23:00</w:t>
+              <w:t>~24:00</w:t>
             </w:r>
           </w:p>
         </w:tc>
@@ -5527,7 +6282,7 @@
               <w:rPr>
                 <w:sz w:val="19"/>
               </w:rPr>
-              <w:t>LA's $161,000 Buyer Assistance Program Nobody Uses</w:t>
+              <w:t>Bilingual Real Estate Marketing Beyond Translation</w:t>
             </w:r>
           </w:p>
         </w:tc>
@@ -5557,7 +6312,7 @@
               <w:rPr>
                 <w:sz w:val="19"/>
               </w:rPr>
-              <w:t>The Catch in Down Payment Assistance: Shared Appreciation</w:t>
+              <w:t>What Law Firm SEO Teaches Realtors</w:t>
             </w:r>
           </w:p>
         </w:tc>
@@ -5587,7 +6342,7 @@
               <w:rPr>
                 <w:sz w:val="19"/>
               </w:rPr>
-              <w:t>How to Find Down Payment Assistance in Your Market</w:t>
+              <w:t>The First Google Business Profile Fix for Agents</w:t>
             </w:r>
           </w:p>
         </w:tc>
@@ -5603,7 +6358,7 @@
               <w:rPr>
                 <w:sz w:val="19"/>
               </w:rPr>
-              <w:t>~32:00</w:t>
+              <w:t>~31:00</w:t>
             </w:r>
           </w:p>
         </w:tc>
@@ -5633,7 +6388,7 @@
               <w:rPr>
                 <w:sz w:val="19"/>
               </w:rPr>
-              <w:t>~34:00</w:t>
+              <w:t>~33:00</w:t>
             </w:r>
           </w:p>
         </w:tc>
@@ -5647,7 +6402,7 @@
               <w:rPr>
                 <w:sz w:val="19"/>
               </w:rPr>
-              <w:t>Where First-Generation Buyers Actually Come From</w:t>
+              <w:t>What's Usually Broken in a Realtor's Online Presence</w:t>
             </w:r>
           </w:p>
         </w:tc>
@@ -5663,7 +6418,7 @@
               <w:rPr>
                 <w:sz w:val="19"/>
               </w:rPr>
-              <w:t>~36:00</w:t>
+              <w:t>~35:00</w:t>
             </w:r>
           </w:p>
         </w:tc>
@@ -5693,7 +6448,7 @@
               <w:rPr>
                 <w:sz w:val="19"/>
               </w:rPr>
-              <w:t>~38:00</w:t>
+              <w:t>~37:00</w:t>
             </w:r>
           </w:p>
         </w:tc>
@@ -5707,7 +6462,7 @@
               <w:rPr>
                 <w:sz w:val="19"/>
               </w:rPr>
-              <w:t>What Brokerages Get Wrong About Spanish-Speaking Buyers</w:t>
+              <w:t>How to Know Your Real Estate Marketing Is Working</w:t>
             </w:r>
           </w:p>
         </w:tc>
@@ -5737,7 +6492,7 @@
               <w:rPr>
                 <w:sz w:val="19"/>
               </w:rPr>
-              <w:t>Making 50 Calls a Day and Closing Nothing? Cut This</w:t>
+              <w:t>No Budget, Five Hours a Week: Where to Spend It</w:t>
             </w:r>
           </w:p>
         </w:tc>
@@ -6253,6 +7008,138 @@
           </w:p>
         </w:tc>
       </w:tr>
+      <w:tr>
+        <w:tc>
+          <w:tcPr>
+            <w:tcW w:type="dxa" w:w="504"/>
+          </w:tcPr>
+          <w:p>
+            <w:r/>
+            <w:r>
+              <w:rPr>
+                <w:sz w:val="19"/>
+              </w:rPr>
+              <w:t>10</w:t>
+            </w:r>
+          </w:p>
+        </w:tc>
+        <w:tc>
+          <w:tcPr>
+            <w:tcW w:type="dxa" w:w="4608"/>
+          </w:tcPr>
+          <w:p>
+            <w:r/>
+            <w:r>
+              <w:rPr>
+                <w:sz w:val="19"/>
+              </w:rPr>
+              <w:t>Revision: Alex sent 18 marketing questions. Adding them all would make two episodes and turn the back half into an agency pitch.</w:t>
+            </w:r>
+          </w:p>
+        </w:tc>
+        <w:tc>
+          <w:tcPr>
+            <w:tcW w:type="dxa" w:w="5040"/>
+          </w:tcPr>
+          <w:p>
+            <w:r/>
+            <w:r>
+              <w:rPr>
+                <w:sz w:val="19"/>
+              </w:rPr>
+              <w:t>Kept seven, rebuilt Blocks 3 and 4 around "how do you find a buyer who isn't looking," merged the old program block into Block 2. Mapping in 4I.</w:t>
+            </w:r>
+          </w:p>
+        </w:tc>
+      </w:tr>
+      <w:tr>
+        <w:tc>
+          <w:tcPr>
+            <w:tcW w:type="dxa" w:w="504"/>
+          </w:tcPr>
+          <w:p>
+            <w:r/>
+            <w:r>
+              <w:rPr>
+                <w:sz w:val="19"/>
+              </w:rPr>
+              <w:t>11</w:t>
+            </w:r>
+          </w:p>
+        </w:tc>
+        <w:tc>
+          <w:tcPr>
+            <w:tcW w:type="dxa" w:w="4608"/>
+          </w:tcPr>
+          <w:p>
+            <w:r/>
+            <w:r>
+              <w:rPr>
+                <w:sz w:val="19"/>
+              </w:rPr>
+              <w:t>Revision: his audit offer is written for LA agents; the audience is national.</w:t>
+            </w:r>
+          </w:p>
+        </w:tc>
+        <w:tc>
+          <w:tcPr>
+            <w:tcW w:type="dxa" w:w="5040"/>
+          </w:tcPr>
+          <w:p>
+            <w:r/>
+            <w:r>
+              <w:rPr>
+                <w:sz w:val="19"/>
+              </w:rPr>
+              <w:t>Green-room check added to the close and to 5D.</w:t>
+            </w:r>
+          </w:p>
+        </w:tc>
+      </w:tr>
+      <w:tr>
+        <w:tc>
+          <w:tcPr>
+            <w:tcW w:type="dxa" w:w="504"/>
+          </w:tcPr>
+          <w:p>
+            <w:r/>
+            <w:r>
+              <w:rPr>
+                <w:sz w:val="19"/>
+              </w:rPr>
+              <w:t>12</w:t>
+            </w:r>
+          </w:p>
+        </w:tc>
+        <w:tc>
+          <w:tcPr>
+            <w:tcW w:type="dxa" w:w="4608"/>
+          </w:tcPr>
+          <w:p>
+            <w:r/>
+            <w:r>
+              <w:rPr>
+                <w:sz w:val="19"/>
+              </w:rPr>
+              <w:t>Revision: the settlement question (old Q8) and the outside-LA programs question (old Q12) no longer fit the runtime.</w:t>
+            </w:r>
+          </w:p>
+        </w:tc>
+        <w:tc>
+          <w:tcPr>
+            <w:tcW w:type="dxa" w:w="5040"/>
+          </w:tcPr>
+          <w:p>
+            <w:r/>
+            <w:r>
+              <w:rPr>
+                <w:sz w:val="19"/>
+              </w:rPr>
+              <w:t>Cut. The homework now carries the outside-LA research step.</w:t>
+            </w:r>
+          </w:p>
+        </w:tc>
+      </w:tr>
     </w:tbl>
     <w:p>
       <w:pPr>
@@ -6522,7 +7409,37 @@
               <w:rPr>
                 <w:sz w:val="19"/>
               </w:rPr>
-              <w:t>Chapter titles work. "The $161,000 Program Nobody Uses" is the most searchable line in the packet.</w:t>
+              <w:t>Chapter titles work. The Google Business Profile and "numbers game" chapters will search well on their own.</w:t>
+            </w:r>
+          </w:p>
+        </w:tc>
+      </w:tr>
+      <w:tr>
+        <w:tc>
+          <w:tcPr>
+            <w:tcW w:type="dxa" w:w="2016"/>
+          </w:tcPr>
+          <w:p>
+            <w:r/>
+            <w:r>
+              <w:rPr>
+                <w:sz w:val="19"/>
+              </w:rPr>
+              <w:t>Justin Welsh</w:t>
+            </w:r>
+          </w:p>
+        </w:tc>
+        <w:tc>
+          <w:tcPr>
+            <w:tcW w:type="dxa" w:w="8136"/>
+          </w:tcPr>
+          <w:p>
+            <w:r/>
+            <w:r>
+              <w:rPr>
+                <w:sz w:val="19"/>
+              </w:rPr>
+              <w:t>Taking the guest's questions is fine. Letting them replace the format is not. Q9 is what keeps it one topic.</w:t>
             </w:r>
           </w:p>
         </w:tc>
@@ -7517,6 +8434,42 @@
       </w:pPr>
       <w:r>
         <w:t>Checked every SAY THIS line is under 20 words, and removed em dashes and curly quotes throughout.</w:t>
+      </w:r>
+    </w:p>
+    <w:p>
+      <w:pPr>
+        <w:pStyle w:val="ListBullet"/>
+        <w:spacing w:after="40"/>
+      </w:pPr>
+      <w:r>
+        <w:t>Revision after Alex's questions: rebuilt Blocks 3 and 4 from seven of his 18 questions, adding Q9, Q10, Q11, Q12, Q14, Q16 and Q17.</w:t>
+      </w:r>
+    </w:p>
+    <w:p>
+      <w:pPr>
+        <w:pStyle w:val="ListBullet"/>
+        <w:spacing w:after="40"/>
+      </w:pPr>
+      <w:r>
+        <w:t>Merged the LIPA question and the shared-appreciation question into Q7 and moved both into Block 2, so all the money talk lives in one block.</w:t>
+      </w:r>
+    </w:p>
+    <w:p>
+      <w:pPr>
+        <w:pStyle w:val="ListBullet"/>
+        <w:spacing w:after="40"/>
+      </w:pPr>
+      <w:r>
+        <w:t>Cut the settlement question, the outside-LA programs question, the brokerage question and the standalone buyer-meeting question to make room.</w:t>
+      </w:r>
+    </w:p>
+    <w:p>
+      <w:pPr>
+        <w:pStyle w:val="ListBullet"/>
+        <w:spacing w:after="40"/>
+      </w:pPr>
+      <w:r>
+        <w:t>Moved the audit to one mention in the close plus a show-notes link, with a check on whether he serves non-LA agents.</w:t>
       </w:r>
     </w:p>
     <w:sectPr>

</xml_diff>